<commit_message>
Data Fetching and Initial Strategy(SMA)
</commit_message>
<xml_diff>
--- a/SB_15 roadmap .docx
+++ b/SB_15 roadmap .docx
@@ -68,14 +68,35 @@
           <w:b/>
           <w:bCs/>
         </w:rPr>
-        <w:t>/om</w:t>
+        <w:t>/</w:t>
       </w:r>
       <w:r>
         <w:rPr>
           <w:b/>
           <w:bCs/>
         </w:rPr>
-        <w:t xml:space="preserve"> → Backend (Backtesting Engine)</w:t>
+        <w:t xml:space="preserve"> </w:t>
+      </w:r>
+      <w:r>
+        <w:rPr>
+          <w:b/>
+          <w:bCs/>
+        </w:rPr>
+        <w:t>roman</w:t>
+      </w:r>
+      <w:r>
+        <w:rPr>
+          <w:b/>
+          <w:bCs/>
+        </w:rPr>
+        <w:t xml:space="preserve"> </w:t>
+      </w:r>
+      <w:r>
+        <w:rPr>
+          <w:b/>
+          <w:bCs/>
+        </w:rPr>
+        <w:t>→ Backend (Backtesting Engine)</w:t>
       </w:r>
     </w:p>
     <w:p>
@@ -106,7 +127,14 @@
           <w:b/>
           <w:bCs/>
         </w:rPr>
-        <w:t>/roman</w:t>
+        <w:t>/</w:t>
+      </w:r>
+      <w:r>
+        <w:rPr>
+          <w:b/>
+          <w:bCs/>
+        </w:rPr>
+        <w:t>om</w:t>
       </w:r>
       <w:r>
         <w:rPr>
@@ -124,7 +152,7 @@
     <w:p>
       <w:r>
         <w:pict w14:anchorId="076E938C">
-          <v:rect id="_x0000_i1571" style="width:0;height:1.5pt" o:hralign="center" o:hrstd="t" o:hr="t" fillcolor="#a0a0a0" stroked="f"/>
+          <v:rect id="_x0000_i1025" style="width:0;height:1.5pt" o:hralign="center" o:hrstd="t" o:hr="t" fillcolor="#a0a0a0" stroked="f"/>
         </w:pict>
       </w:r>
     </w:p>
@@ -322,7 +350,7 @@
     <w:p>
       <w:r>
         <w:pict w14:anchorId="381F1C3B">
-          <v:rect id="_x0000_i1572" style="width:0;height:1.5pt" o:hralign="center" o:hrstd="t" o:hr="t" fillcolor="#a0a0a0" stroked="f"/>
+          <v:rect id="_x0000_i1026" style="width:0;height:1.5pt" o:hralign="center" o:hrstd="t" o:hr="t" fillcolor="#a0a0a0" stroked="f"/>
         </w:pict>
       </w:r>
     </w:p>
@@ -352,7 +380,7 @@
     <w:p>
       <w:r>
         <w:pict w14:anchorId="1C8ACA05">
-          <v:rect id="_x0000_i1573" style="width:0;height:1.5pt" o:hralign="center" o:hrstd="t" o:hr="t" fillcolor="#a0a0a0" stroked="f"/>
+          <v:rect id="_x0000_i1027" style="width:0;height:1.5pt" o:hralign="center" o:hrstd="t" o:hr="t" fillcolor="#a0a0a0" stroked="f"/>
         </w:pict>
       </w:r>
     </w:p>
@@ -527,7 +555,7 @@
     <w:p>
       <w:r>
         <w:pict w14:anchorId="1374D957">
-          <v:rect id="_x0000_i1574" style="width:0;height:1.5pt" o:hralign="center" o:hrstd="t" o:hr="t" fillcolor="#a0a0a0" stroked="f"/>
+          <v:rect id="_x0000_i1028" style="width:0;height:1.5pt" o:hralign="center" o:hrstd="t" o:hr="t" fillcolor="#a0a0a0" stroked="f"/>
         </w:pict>
       </w:r>
     </w:p>
@@ -656,7 +684,7 @@
     <w:p>
       <w:r>
         <w:pict w14:anchorId="04C2A8F0">
-          <v:rect id="_x0000_i1575" style="width:0;height:1.5pt" o:hralign="center" o:hrstd="t" o:hr="t" fillcolor="#a0a0a0" stroked="f"/>
+          <v:rect id="_x0000_i1029" style="width:0;height:1.5pt" o:hralign="center" o:hrstd="t" o:hr="t" fillcolor="#a0a0a0" stroked="f"/>
         </w:pict>
       </w:r>
     </w:p>
@@ -753,7 +781,7 @@
     <w:p>
       <w:r>
         <w:pict w14:anchorId="3AD7B9DB">
-          <v:rect id="_x0000_i1576" style="width:0;height:1.5pt" o:hralign="center" o:hrstd="t" o:hr="t" fillcolor="#a0a0a0" stroked="f"/>
+          <v:rect id="_x0000_i1030" style="width:0;height:1.5pt" o:hralign="center" o:hrstd="t" o:hr="t" fillcolor="#a0a0a0" stroked="f"/>
         </w:pict>
       </w:r>
     </w:p>
@@ -905,7 +933,7 @@
     <w:p>
       <w:r>
         <w:pict w14:anchorId="0101E905">
-          <v:rect id="_x0000_i1577" style="width:0;height:1.5pt" o:hralign="center" o:hrstd="t" o:hr="t" fillcolor="#a0a0a0" stroked="f"/>
+          <v:rect id="_x0000_i1031" style="width:0;height:1.5pt" o:hralign="center" o:hrstd="t" o:hr="t" fillcolor="#a0a0a0" stroked="f"/>
         </w:pict>
       </w:r>
     </w:p>
@@ -1046,7 +1074,7 @@
       <w:r>
         <w:lastRenderedPageBreak/>
         <w:pict w14:anchorId="41550BDB">
-          <v:rect id="_x0000_i1578" style="width:0;height:1.5pt" o:hralign="center" o:hrstd="t" o:hr="t" fillcolor="#a0a0a0" stroked="f"/>
+          <v:rect id="_x0000_i1032" style="width:0;height:1.5pt" o:hralign="center" o:hrstd="t" o:hr="t" fillcolor="#a0a0a0" stroked="f"/>
         </w:pict>
       </w:r>
     </w:p>
@@ -1153,7 +1181,7 @@
     <w:p>
       <w:r>
         <w:pict w14:anchorId="76B49C62">
-          <v:rect id="_x0000_i1579" style="width:0;height:1.5pt" o:hralign="center" o:hrstd="t" o:hr="t" fillcolor="#a0a0a0" stroked="f"/>
+          <v:rect id="_x0000_i1033" style="width:0;height:1.5pt" o:hralign="center" o:hrstd="t" o:hr="t" fillcolor="#a0a0a0" stroked="f"/>
         </w:pict>
       </w:r>
     </w:p>
@@ -1283,7 +1311,7 @@
     <w:p>
       <w:r>
         <w:pict w14:anchorId="09E06061">
-          <v:rect id="_x0000_i1580" style="width:0;height:1.5pt" o:hralign="center" o:hrstd="t" o:hr="t" fillcolor="#a0a0a0" stroked="f"/>
+          <v:rect id="_x0000_i1034" style="width:0;height:1.5pt" o:hralign="center" o:hrstd="t" o:hr="t" fillcolor="#a0a0a0" stroked="f"/>
         </w:pict>
       </w:r>
     </w:p>
@@ -1380,7 +1408,7 @@
     <w:p>
       <w:r>
         <w:pict w14:anchorId="7FDE179E">
-          <v:rect id="_x0000_i1581" style="width:0;height:1.5pt" o:hralign="center" o:hrstd="t" o:hr="t" fillcolor="#a0a0a0" stroked="f"/>
+          <v:rect id="_x0000_i1035" style="width:0;height:1.5pt" o:hralign="center" o:hrstd="t" o:hr="t" fillcolor="#a0a0a0" stroked="f"/>
         </w:pict>
       </w:r>
     </w:p>
@@ -1465,7 +1493,7 @@
     <w:p>
       <w:r>
         <w:pict w14:anchorId="063CF2F3">
-          <v:rect id="_x0000_i1582" style="width:0;height:1.5pt" o:hralign="center" o:hrstd="t" o:hr="t" fillcolor="#a0a0a0" stroked="f"/>
+          <v:rect id="_x0000_i1036" style="width:0;height:1.5pt" o:hralign="center" o:hrstd="t" o:hr="t" fillcolor="#a0a0a0" stroked="f"/>
         </w:pict>
       </w:r>
     </w:p>
@@ -1628,7 +1656,7 @@
     <w:p>
       <w:r>
         <w:pict w14:anchorId="6B411324">
-          <v:rect id="_x0000_i1583" style="width:0;height:1.5pt" o:hralign="center" o:hrstd="t" o:hr="t" fillcolor="#a0a0a0" stroked="f"/>
+          <v:rect id="_x0000_i1037" style="width:0;height:1.5pt" o:hralign="center" o:hrstd="t" o:hr="t" fillcolor="#a0a0a0" stroked="f"/>
         </w:pict>
       </w:r>
     </w:p>
@@ -1703,7 +1731,7 @@
     <w:p>
       <w:r>
         <w:pict w14:anchorId="3A883521">
-          <v:rect id="_x0000_i1584" style="width:0;height:1.5pt" o:hralign="center" o:hrstd="t" o:hr="t" fillcolor="#a0a0a0" stroked="f"/>
+          <v:rect id="_x0000_i1038" style="width:0;height:1.5pt" o:hralign="center" o:hrstd="t" o:hr="t" fillcolor="#a0a0a0" stroked="f"/>
         </w:pict>
       </w:r>
     </w:p>
@@ -1810,7 +1838,7 @@
     <w:p>
       <w:r>
         <w:pict w14:anchorId="166AFFF1">
-          <v:rect id="_x0000_i1585" style="width:0;height:1.5pt" o:hralign="center" o:hrstd="t" o:hr="t" fillcolor="#a0a0a0" stroked="f"/>
+          <v:rect id="_x0000_i1039" style="width:0;height:1.5pt" o:hralign="center" o:hrstd="t" o:hr="t" fillcolor="#a0a0a0" stroked="f"/>
         </w:pict>
       </w:r>
     </w:p>
@@ -1928,7 +1956,7 @@
     <w:p>
       <w:r>
         <w:pict w14:anchorId="21E988EF">
-          <v:rect id="_x0000_i1586" style="width:0;height:1.5pt" o:hralign="center" o:hrstd="t" o:hr="t" fillcolor="#a0a0a0" stroked="f"/>
+          <v:rect id="_x0000_i1040" style="width:0;height:1.5pt" o:hralign="center" o:hrstd="t" o:hr="t" fillcolor="#a0a0a0" stroked="f"/>
         </w:pict>
       </w:r>
     </w:p>
@@ -2109,7 +2137,7 @@
     <w:p>
       <w:r>
         <w:pict w14:anchorId="1736FE23">
-          <v:rect id="_x0000_i1587" style="width:0;height:1.5pt" o:hralign="center" o:hrstd="t" o:hr="t" fillcolor="#a0a0a0" stroked="f"/>
+          <v:rect id="_x0000_i1041" style="width:0;height:1.5pt" o:hralign="center" o:hrstd="t" o:hr="t" fillcolor="#a0a0a0" stroked="f"/>
         </w:pict>
       </w:r>
     </w:p>
@@ -2165,7 +2193,7 @@
     <w:p>
       <w:r>
         <w:pict w14:anchorId="33C038DE">
-          <v:rect id="_x0000_i1588" style="width:0;height:1.5pt" o:hralign="center" o:hrstd="t" o:hr="t" fillcolor="#a0a0a0" stroked="f"/>
+          <v:rect id="_x0000_i1042" style="width:0;height:1.5pt" o:hralign="center" o:hrstd="t" o:hr="t" fillcolor="#a0a0a0" stroked="f"/>
         </w:pict>
       </w:r>
     </w:p>
@@ -2268,7 +2296,7 @@
     <w:p>
       <w:r>
         <w:pict w14:anchorId="7052604E">
-          <v:rect id="_x0000_i1589" style="width:0;height:1.5pt" o:hralign="center" o:hrstd="t" o:hr="t" fillcolor="#a0a0a0" stroked="f"/>
+          <v:rect id="_x0000_i1043" style="width:0;height:1.5pt" o:hralign="center" o:hrstd="t" o:hr="t" fillcolor="#a0a0a0" stroked="f"/>
         </w:pict>
       </w:r>
     </w:p>
@@ -11332,6 +11360,7 @@
   <w:style w:type="character" w:default="1" w:styleId="DefaultParagraphFont">
     <w:name w:val="Default Paragraph Font"/>
     <w:uiPriority w:val="1"/>
+    <w:semiHidden/>
     <w:unhideWhenUsed/>
   </w:style>
   <w:style w:type="table" w:default="1" w:styleId="TableNormal">

</xml_diff>